<commit_message>
Add images folder and docx templates 6-9; update templates 1-5
Co-authored-by: Cursor <cursoragent@cursor.com>
</commit_message>
<xml_diff>
--- a/templates_docx/Шаблон 1 ДП.docx
+++ b/templates_docx/Шаблон 1 ДП.docx
@@ -223,8 +223,23 @@
               <w:jc w:val="right"/>
               <w:rPr>
                 <w:rFonts w:ascii="Montserrat Medium" w:eastAsia="Montserrat Medium" w:hAnsi="Montserrat Medium" w:cs="Montserrat Medium"/>
-              </w:rPr>
-            </w:pPr>
+                <w:lang w:val="en-US"/>
+              </w:rPr>
+            </w:pPr>
+            <w:r>
+              <w:rPr>
+                <w:rFonts w:ascii="Montserrat Medium" w:eastAsia="Montserrat Medium" w:hAnsi="Montserrat Medium" w:cs="Montserrat Medium"/>
+                <w:lang w:val="ru-RU"/>
+              </w:rPr>
+              <w:t xml:space="preserve">Номер: </w:t>
+            </w:r>
+            <w:r>
+              <w:rPr>
+                <w:rFonts w:ascii="Montserrat Medium" w:eastAsia="Montserrat Medium" w:hAnsi="Montserrat Medium" w:cs="Montserrat Medium"/>
+                <w:lang w:val="en-US"/>
+              </w:rPr>
+              <w:t>{{ number }}</w:t>
+            </w:r>
           </w:p>
         </w:tc>
       </w:tr>

</xml_diff>